<commit_message>
Převzetí textu z webu StandardLand do šesti extraktů
16403-2, 24099, 14814, 17444-2, 16312 a 15762: obsahové úpravy, které
byly publikované na webu a chyběly v repozitáři (termíny podle šablony,
Předmět 24099, kapitoly a přílohy 16403-2). V 16403-2 smazány komentáře,
které web zapracoval. Markdown přegenerovaný.

Co-Authored-By: Claude Opus 5.5 <noreply@anthropic.com>
Claude-Session: https://claude.ai/code/session_013XsG4Ss77xGbwrRyA4pUBh
</commit_message>
<xml_diff>
--- a/extrakty/doc/TC278WG12/extract_14814_(2008).docx
+++ b/extrakty/doc/TC278WG12/extract_14814_(2008).docx
@@ -304,7 +304,7 @@
       </w:pPr>
       <w:r>
         <w:rPr/>
-        <w:t>Čtenáři této normy nepotřebují na její pochopení žádné další normy. Tato norma definuje architekturu norem automatické identifikace vozidel, a proto souvisí se všemi normami AVI/AEI.</w:t>
+        <w:t xml:space="preserve">Čtenáři této normy nepotřebují pro její pochopení žádné další normy. Tato norma definuje architekturu norem automatické identifikace vozidel, a proto souvisí se všemi normami AVI/AEI.</w:t>
       </w:r>
     </w:p>
     <w:p>
@@ -366,6 +366,16 @@
     <w:p>
       <w:pPr>
         <w:pStyle w:val="Textnormy"/>
+        <w:rPr/>
+      </w:pPr>
+      <w:r>
+        <w:rPr/>
+        <w:t xml:space="preserve">V normě je uvedeno 28 termínů, z nichž klíčové jsou následující:</w:t>
+      </w:r>
+    </w:p>
+    <w:p>
+      <w:pPr>
+        <w:pStyle w:val="Textnormy"/>
         <w:spacing w:before="120" w:after="120"/>
         <w:rPr/>
       </w:pPr>
@@ -373,17 +383,21 @@
         <w:rPr>
           <w:b/>
         </w:rPr>
-        <w:t xml:space="preserve">3.5 automatická identifikace zařízení AEI </w:t>
+        <w:t xml:space="preserve">automatická identifikace zařízení AEI</w:t>
+      </w:r>
+      <w:r>
+        <w:rPr/>
+        <w:t xml:space="preserve"> </w:t>
       </w:r>
       <w:r>
         <w:rPr>
           <w:i/>
         </w:rPr>
-        <w:t xml:space="preserve">(automatic equipment identification AEI) </w:t>
-      </w:r>
-      <w:r>
-        <w:rPr/>
-        <w:t>proces zjištění totožnosti zařízení nebo entit, které se používají při dopravě na pozemních komunikacích pomocí OBE obsahující jednoznačnou strukturu dat definovanou v této normě</w:t>
+        <w:t xml:space="preserve">(automatic equipment identification AEI)</w:t>
+      </w:r>
+      <w:r>
+        <w:rPr/>
+        <w:t xml:space="preserve"> – proces zjištění totožnosti zařízení nebo entit, které se používají při dopravě na pozemních komunikacích pomocí OBE obsahující jednoznačnou strukturu dat definovanou v této normě</w:t>
       </w:r>
     </w:p>
     <w:p>
@@ -396,17 +410,21 @@
         <w:rPr>
           <w:b/>
         </w:rPr>
-        <w:t xml:space="preserve">3.7 automatická identifikace vozidla AVI </w:t>
+        <w:t xml:space="preserve">automatická identifikace vozidla AVI</w:t>
+      </w:r>
+      <w:r>
+        <w:rPr/>
+        <w:t xml:space="preserve"> </w:t>
       </w:r>
       <w:r>
         <w:rPr>
           <w:i/>
         </w:rPr>
-        <w:t xml:space="preserve">(automatic vehicle identification AVI) </w:t>
-      </w:r>
-      <w:r>
-        <w:rPr/>
-        <w:t>proces identifikace vozidla za použití jednoznačné datové struktury, jež je uložena v OBE, definované touto normou</w:t>
+        <w:t xml:space="preserve">(automatic vehicle identification AVI)</w:t>
+      </w:r>
+      <w:r>
+        <w:rPr/>
+        <w:t xml:space="preserve"> – proces identifikace vozidla za použití jednoznačné datové struktury, jež je uložena v OBE, definované touto normou</w:t>
       </w:r>
     </w:p>
     <w:p>
@@ -419,27 +437,31 @@
         <w:rPr>
           <w:b/>
         </w:rPr>
-        <w:t xml:space="preserve">3.18 palubní zařízení OBE </w:t>
+        <w:t xml:space="preserve">palubní zařízení OBE</w:t>
+      </w:r>
+      <w:r>
+        <w:rPr/>
+        <w:t xml:space="preserve"> </w:t>
       </w:r>
       <w:r>
         <w:rPr>
           <w:i/>
         </w:rPr>
-        <w:t xml:space="preserve">(on-board equipment OBE) </w:t>
-      </w:r>
-      <w:r>
-        <w:rPr/>
-        <w:t xml:space="preserve">zařízení zajišťující funkci AVI/AEI umístěné ve vozidle nebo jeho dalším zařízení </w:t>
-      </w:r>
-    </w:p>
-    <w:p>
-      <w:pPr>
-        <w:pStyle w:val="Textnormy"/>
-        <w:rPr/>
-      </w:pPr>
-      <w:r>
-        <w:rPr/>
-        <w:t>Pro pochopení textu tohoto extraktu zde není nutné zmiňovat jakýkoliv další z 28 termínů uvedených v normě.</w:t>
+        <w:t xml:space="preserve">(on-board equipment OBE)</w:t>
+      </w:r>
+      <w:r>
+        <w:rPr/>
+        <w:t xml:space="preserve"> – zařízení zajišťující funkci AVI/AEI umístěné ve vozidle nebo jeho dalším zařízení</w:t>
+      </w:r>
+    </w:p>
+    <w:p>
+      <w:pPr>
+        <w:pStyle w:val="Textnormy"/>
+        <w:rPr/>
+      </w:pPr>
+      <w:r>
+        <w:rPr/>
+        <w:t xml:space="preserve">Další termíny a zkratky z oboru ITS jsou obsaženy ve slovníku ITS terminology (www.ITSterminology.org).</w:t>
       </w:r>
     </w:p>
     <w:p>
@@ -466,7 +488,7 @@
           <w:sz w:val="22"/>
           <w:szCs w:val="22"/>
         </w:rPr>
-        <w:t xml:space="preserve">Kapitola 4 Požadavky </w:t>
+        <w:t xml:space="preserve">4 Požadavky</w:t>
       </w:r>
     </w:p>
     <w:p>

</xml_diff>

<commit_message>
Struktura extraktů podle webu a hlavičky podle Národního plánu 2026
Struktura (všech 75 Wordů): Úvod s poznámkou o vybraných kapitolách,
Užití, 1 Předmět normy, 2 Souvisící normy (bez „výběru“), 3 Termíny
a definice, 4 Symboly a zkratky, odkazy na slovník ITS terminology,
pak ostatní kapitoly. Původní čísla kapitol norem zachována; Předmluva
14819-6 sloučena do Úvodu; Citované/normativní dokumenty sloučeny do
Souvisících norem (16312, 16152, 16219, 20452); doplněn oddíl termínů
v 15762 a zkratek v 16410-2.

Hlavičky podle Národního plánu sekretariátu: 21219-19 zpět na
ISO/TS 21219-19:2016, 21219-2 rok 2014, 18234-7 až -9 a 24099 místo
návrhů vydaná označení, doplněné roky vydání u 18234-10, -11, 15762,
16152, 16690, 17267, 20452 a 17572-3. Rok zpracování extraktu
v názvu souboru: 16152 → 2012, 16219 → 2013, 17572-1/-2 → 2008,
21219-15 → 2019.

Co-Authored-By: Claude Opus 5.5 <noreply@anthropic.com>
Claude-Session: https://claude.ai/code/session_013XsG4Ss77xGbwrRyA4pUBh
</commit_message>
<xml_diff>
--- a/extrakty/doc/TC278WG12/extract_14814_(2008).docx
+++ b/extrakty/doc/TC278WG12/extract_14814_(2008).docx
@@ -200,6 +200,16 @@
     <w:p>
       <w:pPr>
         <w:pStyle w:val="Textnormy"/>
+        <w:rPr/>
+      </w:pPr>
+      <w:r>
+        <w:rPr/>
+        <w:t xml:space="preserve">Poznámka: Extrakt uvádí vybrané kapitoly popisovaného dokumentu a přejímá původní číslování kapitol.</w:t>
+      </w:r>
+    </w:p>
+    <w:p>
+      <w:pPr>
+        <w:pStyle w:val="Textnormy"/>
         <w:rPr>
           <w:b/>
           <w:sz w:val="22"/>
@@ -294,17 +304,27 @@
           <w:sz w:val="22"/>
           <w:szCs w:val="22"/>
         </w:rPr>
-        <w:t>Souvisící normy</w:t>
-      </w:r>
-    </w:p>
-    <w:p>
-      <w:pPr>
-        <w:pStyle w:val="Textnormy"/>
-        <w:rPr/>
-      </w:pPr>
-      <w:r>
-        <w:rPr/>
-        <w:t xml:space="preserve">Čtenáři této normy nepotřebují pro její pochopení žádné další normy. Tato norma definuje architekturu norem automatické identifikace vozidel, a proto souvisí se všemi normami AVI/AEI.</w:t>
+        <w:t>1 Předmět normy</w:t>
+      </w:r>
+    </w:p>
+    <w:p>
+      <w:pPr>
+        <w:pStyle w:val="Textnormy"/>
+        <w:rPr/>
+      </w:pPr>
+      <w:r>
+        <w:rPr/>
+        <w:t>Tato norma specifikuje celkovou architekturu systémů pro automatickou identifikaci vozidel a zařízení (AVI/AEI) v pěti úrovních. Jedná se o koncepční, funkční, datovou, aplikační a implementační architekturu. Každý typ architektury je obecně popsán a je uveden odkaz na normu v rámci norem AVI/AEI, která danou problematiku řeší (například datová architektura v EN ISO 14816). Dále jsou zde uvedeny základní termíny a definice systému AVI/AEI.</w:t>
+      </w:r>
+    </w:p>
+    <w:p>
+      <w:pPr>
+        <w:pStyle w:val="Textnormy"/>
+        <w:rPr/>
+      </w:pPr>
+      <w:r>
+        <w:rPr/>
+        <w:t>Popis jednotlivých typů architektur je uveden v hlavním těle normy; podrobnější rozvedení popisu a použití je uvedeno v příloze A.</w:t>
       </w:r>
     </w:p>
     <w:p>
@@ -322,27 +342,17 @@
           <w:sz w:val="22"/>
           <w:szCs w:val="22"/>
         </w:rPr>
-        <w:t>1 Předmět normy</w:t>
-      </w:r>
-    </w:p>
-    <w:p>
-      <w:pPr>
-        <w:pStyle w:val="Textnormy"/>
-        <w:rPr/>
-      </w:pPr>
-      <w:r>
-        <w:rPr/>
-        <w:t>Tato norma specifikuje celkovou architekturu systémů pro automatickou identifikaci vozidel a zařízení (AVI/AEI) v pěti úrovních. Jedná se o koncepční, funkční, datovou, aplikační a implementační architekturu. Každý typ architektury je obecně popsán a je uveden odkaz na normu v rámci norem AVI/AEI, která danou problematiku řeší (například datová architektura v EN ISO 14816). Dále jsou zde uvedeny základní termíny a definice systému AVI/AEI.</w:t>
-      </w:r>
-    </w:p>
-    <w:p>
-      <w:pPr>
-        <w:pStyle w:val="Textnormy"/>
-        <w:rPr/>
-      </w:pPr>
-      <w:r>
-        <w:rPr/>
-        <w:t>Popis jednotlivých typů architektur je uveden v hlavním těle normy; podrobnější rozvedení popisu a použití je uvedeno v příloze A.</w:t>
+        <w:t xml:space="preserve">2 Souvisící normy</w:t>
+      </w:r>
+    </w:p>
+    <w:p>
+      <w:pPr>
+        <w:pStyle w:val="Textnormy"/>
+        <w:rPr/>
+      </w:pPr>
+      <w:r>
+        <w:rPr/>
+        <w:t xml:space="preserve">Čtenáři této normy nepotřebují pro její pochopení žádné další normy. Tato norma definuje architekturu norem automatické identifikace vozidel, a proto souvisí se všemi normami AVI/AEI.</w:t>
       </w:r>
     </w:p>
     <w:p>
@@ -640,7 +650,7 @@
             </wp:cNvGraphicFramePr>
             <a:graphic xmlns:a="http://schemas.openxmlformats.org/drawingml/2006/main">
               <a:graphicData uri="http://schemas.openxmlformats.org/drawingml/2006/picture">
-                <pic:pic xmlns:pic="http://schemas.openxmlformats.org/drawingml/2006/picture">
+                <pic:pic>
                   <pic:nvPicPr>
                     <pic:cNvPr id="1" name="Image1"/>
                     <pic:cNvPicPr>
@@ -924,7 +934,7 @@
             </wp:cNvGraphicFramePr>
             <a:graphic xmlns:a="http://schemas.openxmlformats.org/drawingml/2006/main">
               <a:graphicData uri="http://schemas.openxmlformats.org/drawingml/2006/picture">
-                <pic:pic xmlns:pic="http://schemas.openxmlformats.org/drawingml/2006/picture">
+                <pic:pic>
                   <pic:nvPicPr>
                     <pic:cNvPr id="2" name="Image2"/>
                     <pic:cNvPicPr>

</xml_diff>

<commit_message>
Hlavičky podle vydání ISO/CEN (standards.iteh.ai), bez českých údajů
Podle pokynu sekretáře komise: české vydání se v hlavičce neuvádí.
Všech 79 extraktů: titul podle typu dokumentu (evropská norma,
mezinárodní norma ISO, technická specifikace / zpráva ISO či CEN),
označení ISO/CEN (u společných dokumentů EN ISO / CEN ISO/TS),
„Vydána RRRR, N stran“ podle vydání, které extrakt popisuje.
Odstraněna označení ČSN, „Platí od“, třídicí znaky a řádky
„Zavedena v ČSN“. Seznam norem a registr podle nových označení.

Co-Authored-By: Claude Opus 5.5 <noreply@anthropic.com>
Claude-Session: https://claude.ai/code/session_013XsG4Ss77xGbwrRyA4pUBh
</commit_message>
<xml_diff>
--- a/extrakty/doc/TC278WG12/extract_14814_(2008).docx
+++ b/extrakty/doc/TC278WG12/extract_14814_(2008).docx
@@ -25,7 +25,7 @@
           <w:sz w:val="40"/>
           <w:szCs w:val="40"/>
         </w:rPr>
-        <w:t>EXTRAKT z české technické normy</w:t>
+        <w:t xml:space="preserve">EXTRAKT z evropské normy</w:t>
       </w:r>
     </w:p>
     <w:p>
@@ -134,9 +134,9 @@
             </w:pPr>
             <w:r>
               <w:rPr/>
-              <w:t>ČSN</w:t>
+              <w:t xml:space="preserve">EN ISO 14814</w:t>
               <w:br/>
-              <w:t>EN ISO 14814</w:t>
+              <w:t/>
               <w:br/>
             </w:r>
           </w:p>
@@ -148,7 +148,7 @@
             </w:pPr>
             <w:r>
               <w:rPr/>
-              <w:t>01 8339</w:t>
+              <w:t xml:space="preserve"/>
             </w:r>
           </w:p>
         </w:tc>
@@ -164,9 +164,9 @@
       </w:pPr>
       <w:r>
         <w:rPr/>
-        <w:t>Platí od 1.1.2007</w:t>
+        <w:t xml:space="preserve">Vydána 2006, 19 stran</w:t>
         <w:tab/>
-        <w:t>20 stran</w:t>
+        <w:t/>
       </w:r>
     </w:p>
     <w:p>

</xml_diff>